<commit_message>
Sumo al plan el CV y la busqueda de docencia, investigacion y cargos
- Plan: paso CV despues de los casos de Ideo Maker, con la advertencia de
  que la version academica no puede esperar si se postula a la UDP.
- Extra: meta de postular a por lo menos tres universidades en octubre de
  2026, y la busqueda en documentacion/oportunidades-2026.md.
- Marco como hechas la Fase 0 y el dominio, y actualizo los enlaces del
  documento, que todavia decian que la migracion estaba pendiente.

La unica convocatoria universitaria abierta que calza es la de la UDP,
Laboratorio de Metodologias Creativas, que cierra el 6 de octubre.

Co-Authored-By: Claude Opus 5.5 <noreply@anthropic.com>
</commit_message>
<xml_diff>
--- a/documentacion/Proyecto-portafolio.docx
+++ b/documentacion/Proyecto-portafolio.docx
@@ -60,7 +60,7 @@
           <w:color w:val="1F4E5F"/>
           <w:sz w:val="20"/>
         </w:rPr>
-        <w:t>Actualizado al 21 de septiembre de 2026</w:t>
+        <w:t>Actualizado al 24 de septiembre de 2026</w:t>
       </w:r>
     </w:p>
     <w:tbl>
@@ -224,7 +224,7 @@
                 <w:color w:val="5A5A5A"/>
                 <w:sz w:val="18"/>
               </w:rPr>
-              <w:t>https://fewiyo.github.io/japortafolio-2.0/</w:t>
+              <w:t>https://japortafolio.com</w:t>
             </w:r>
           </w:p>
         </w:tc>
@@ -321,7 +321,7 @@
                 <w:color w:val="111111"/>
                 <w:sz w:val="18"/>
               </w:rPr>
-              <w:t>Dominio propio</w:t>
+              <w:t>Analítica</w:t>
             </w:r>
           </w:p>
         </w:tc>
@@ -352,7 +352,7 @@
                 <w:color w:val="5A5A5A"/>
                 <w:sz w:val="18"/>
               </w:rPr>
-              <w:t>japortafolio.com — hoy sirve el sitio ANTIGUO. Migración pendiente</w:t>
+              <w:t>https://vicentecaceresfarias.goatcounter.com</w:t>
             </w:r>
           </w:p>
         </w:tc>
@@ -609,6 +609,134 @@
                 <w:sz w:val="18"/>
               </w:rPr>
               <w:t>documentacion/linea-base-2026-09-20.md</w:t>
+            </w:r>
+          </w:p>
+        </w:tc>
+      </w:tr>
+      <w:tr>
+        <w:tc>
+          <w:tcPr>
+            <w:tcW w:type="dxa" w:w="2608"/>
+            <w:tcMar>
+              <w:top w:w="70" w:type="dxa"/>
+              <w:bottom w:w="70" w:type="dxa"/>
+              <w:left w:w="120" w:type="dxa"/>
+              <w:right w:w="120" w:type="dxa"/>
+            </w:tcMar>
+            <w:tcBorders>
+              <w:top w:val="single" w:sz="4" w:color="D8D6D2"/>
+              <w:bottom w:val="single" w:sz="4" w:color="D8D6D2"/>
+              <w:left w:val="nil"/>
+              <w:right w:val="nil"/>
+            </w:tcBorders>
+          </w:tcPr>
+          <w:p>
+            <w:pPr>
+              <w:spacing w:after="0" w:before="0" w:line="269" w:lineRule="auto"/>
+            </w:pPr>
+            <w:r>
+              <w:rPr>
+                <w:rFonts w:ascii="Segoe UI" w:hAnsi="Segoe UI"/>
+                <w:b w:val="0"/>
+                <w:color w:val="111111"/>
+                <w:sz w:val="18"/>
+              </w:rPr>
+              <w:t>Casos de Ideo Maker</w:t>
+            </w:r>
+          </w:p>
+        </w:tc>
+        <w:tc>
+          <w:tcPr>
+            <w:tcW w:type="dxa" w:w="7143"/>
+            <w:tcMar>
+              <w:top w:w="70" w:type="dxa"/>
+              <w:bottom w:w="70" w:type="dxa"/>
+              <w:left w:w="120" w:type="dxa"/>
+              <w:right w:w="120" w:type="dxa"/>
+            </w:tcMar>
+            <w:tcBorders>
+              <w:top w:val="single" w:sz="4" w:color="D8D6D2"/>
+              <w:bottom w:val="single" w:sz="4" w:color="D8D6D2"/>
+              <w:left w:val="nil"/>
+              <w:right w:val="nil"/>
+            </w:tcBorders>
+          </w:tcPr>
+          <w:p>
+            <w:pPr>
+              <w:spacing w:after="0" w:before="0" w:line="269" w:lineRule="auto"/>
+            </w:pPr>
+            <w:r>
+              <w:rPr>
+                <w:rFonts w:ascii="Segoe UI" w:hAnsi="Segoe UI"/>
+                <w:b w:val="0"/>
+                <w:color w:val="5A5A5A"/>
+                <w:sz w:val="18"/>
+              </w:rPr>
+              <w:t>documentacion/casos-ideo-maker.md</w:t>
+            </w:r>
+          </w:p>
+        </w:tc>
+      </w:tr>
+      <w:tr>
+        <w:tc>
+          <w:tcPr>
+            <w:tcW w:type="dxa" w:w="2608"/>
+            <w:tcMar>
+              <w:top w:w="70" w:type="dxa"/>
+              <w:bottom w:w="70" w:type="dxa"/>
+              <w:left w:w="120" w:type="dxa"/>
+              <w:right w:w="120" w:type="dxa"/>
+            </w:tcMar>
+            <w:tcBorders>
+              <w:top w:val="single" w:sz="4" w:color="D8D6D2"/>
+              <w:bottom w:val="single" w:sz="4" w:color="D8D6D2"/>
+              <w:left w:val="nil"/>
+              <w:right w:val="nil"/>
+            </w:tcBorders>
+          </w:tcPr>
+          <w:p>
+            <w:pPr>
+              <w:spacing w:after="0" w:before="0" w:line="269" w:lineRule="auto"/>
+            </w:pPr>
+            <w:r>
+              <w:rPr>
+                <w:rFonts w:ascii="Segoe UI" w:hAnsi="Segoe UI"/>
+                <w:b w:val="0"/>
+                <w:color w:val="111111"/>
+                <w:sz w:val="18"/>
+              </w:rPr>
+              <w:t>Oportunidades (extra)</w:t>
+            </w:r>
+          </w:p>
+        </w:tc>
+        <w:tc>
+          <w:tcPr>
+            <w:tcW w:type="dxa" w:w="7143"/>
+            <w:tcMar>
+              <w:top w:w="70" w:type="dxa"/>
+              <w:bottom w:w="70" w:type="dxa"/>
+              <w:left w:w="120" w:type="dxa"/>
+              <w:right w:w="120" w:type="dxa"/>
+            </w:tcMar>
+            <w:tcBorders>
+              <w:top w:val="single" w:sz="4" w:color="D8D6D2"/>
+              <w:bottom w:val="single" w:sz="4" w:color="D8D6D2"/>
+              <w:left w:val="nil"/>
+              <w:right w:val="nil"/>
+            </w:tcBorders>
+          </w:tcPr>
+          <w:p>
+            <w:pPr>
+              <w:spacing w:after="0" w:before="0" w:line="269" w:lineRule="auto"/>
+            </w:pPr>
+            <w:r>
+              <w:rPr>
+                <w:rFonts w:ascii="Segoe UI" w:hAnsi="Segoe UI"/>
+                <w:b w:val="0"/>
+                <w:color w:val="5A5A5A"/>
+                <w:sz w:val="18"/>
+              </w:rPr>
+              <w:t>documentacion/oportunidades-2026.md</w:t>
             </w:r>
           </w:p>
         </w:tc>
@@ -5252,7 +5380,7 @@
           <w:color w:val="111111"/>
           <w:sz w:val="22"/>
         </w:rPr>
-        <w:t>Limpiar  ·  esta semana  ·  fase nueva</w:t>
+        <w:t>Limpiar  ·  HECHA el 22 de septiembre</w:t>
       </w:r>
     </w:p>
     <w:p>
@@ -5266,7 +5394,7 @@
           <w:color w:val="111111"/>
           <w:sz w:val="20"/>
         </w:rPr>
-        <w:t>Borrar los dos CV con RUT que siguen públicos en japortafolio.com y pedir la retirada de cada URL en Search Console. Poner LinkedIn al día y tratarlo como parte del sistema, no como un perfil abandonado. Instalar la analítica. Nada de esto es construir: es sacar y ordenar. Es lo más barato y lo más urgente, y no existía en el plan anterior.</w:t>
+        <w:t>Los CV con RUT se borraron y Google los retiró de la búsqueda. LinkedIn quedó al día: foto, fechas, URL y la tarjeta de Destacado. La analítica, GoatCounter, está instalada en todas las páginas.</w:t>
       </w:r>
     </w:p>
     <w:p>
@@ -5328,7 +5456,7 @@
           <w:color w:val="111111"/>
           <w:sz w:val="22"/>
         </w:rPr>
-        <w:t>El dominio  ·  sube desde el tercer lugar</w:t>
+        <w:t>El dominio  ·  HECHA el 20 de septiembre</w:t>
       </w:r>
     </w:p>
     <w:p>
@@ -5342,7 +5470,7 @@
           <w:color w:val="111111"/>
           <w:sz w:val="20"/>
         </w:rPr>
-        <w:t>Mover japortafolio.com al sitio nuevo. Ya no es cosmético: hoy ese dominio ES la identidad pública de Vicente para las IA, y está sirviendo una versión equivocada. Migrar reemplaza información mala por buena en la dirección que ya tiene autoridad. Del lado del sitio es una línea en construir.py; el resto es DNS.</w:t>
+        <w:t>japortafolio.com sirve el sitio nuevo. El WordPress antiguo se borró.</w:t>
       </w:r>
     </w:p>
     <w:p>
@@ -5366,7 +5494,7 @@
           <w:color w:val="111111"/>
           <w:sz w:val="22"/>
         </w:rPr>
-        <w:t>Los casos de Ideo Maker</w:t>
+        <w:t>Los casos de Ideo Maker  ·  EN CURSO</w:t>
       </w:r>
     </w:p>
     <w:p>
@@ -5380,7 +5508,45 @@
           <w:color w:val="111111"/>
           <w:sz w:val="20"/>
         </w:rPr>
-        <w:t>Atacama, Antofagasta, Taltal y Calama. Cambió de naturaleza: ya no es solo contenido de Vicente, es trabajo compartido con la empresa, y él está adentro para empujarlo. Requiere resolver antes qué se puede publicar.</w:t>
+        <w:t>El trabajo desde 2022 ya está ordenado en casos-ideo-maker.md: tres fichas publicadas se completaron el 24 de septiembre, y hay siete candidatos a proyecto nuevo. Falta el material: fotos, documentos y qué se puede mostrar de cada uno.</w:t>
+      </w:r>
+    </w:p>
+    <w:p>
+      <w:pPr>
+        <w:spacing w:before="160" w:after="40"/>
+        <w:ind w:left="539" w:hanging="539"/>
+      </w:pPr>
+      <w:r>
+        <w:rPr>
+          <w:rFonts w:ascii="Segoe UI" w:hAnsi="Segoe UI"/>
+          <w:b/>
+          <w:color w:val="1F4E5F"/>
+          <w:sz w:val="22"/>
+        </w:rPr>
+        <w:t xml:space="preserve">CV.  </w:t>
+      </w:r>
+      <w:r>
+        <w:rPr>
+          <w:rFonts w:ascii="Segoe UI" w:hAnsi="Segoe UI"/>
+          <w:b/>
+          <w:color w:val="111111"/>
+          <w:sz w:val="22"/>
+        </w:rPr>
+        <w:t>Un CV más completo  ·  después de C</w:t>
+      </w:r>
+    </w:p>
+    <w:p>
+      <w:pPr>
+        <w:spacing w:after="120"/>
+        <w:ind w:left="539"/>
+      </w:pPr>
+      <w:r>
+        <w:rPr>
+          <w:rFonts w:ascii="Segoe UI" w:hAnsi="Segoe UI"/>
+          <w:color w:val="111111"/>
+          <w:sz w:val="20"/>
+        </w:rPr>
+        <w:t>Con los casos de Ideo Maker subidos, rehacer el CV para que cuente lo mismo que el sitio. Dos versiones: una profesional y una académica, que es la que piden las universidades. Ojo: si se postula a la UDP antes del 6 de octubre, la versión académica no puede esperar a C y se arma con lo que ya está ordenado.</w:t>
       </w:r>
     </w:p>
     <w:p>
@@ -5571,6 +5737,117 @@
           <w:sz w:val="20"/>
         </w:rPr>
         <w:t>Mismo montaje, las mismas seis preguntas, y se compara contra la línea base.</w:t>
+      </w:r>
+    </w:p>
+    <w:p>
+      <w:r>
+        <w:br w:type="page"/>
+      </w:r>
+    </w:p>
+    <w:p>
+      <w:pPr>
+        <w:spacing w:before="260" w:after="80"/>
+      </w:pPr>
+      <w:r>
+        <w:rPr>
+          <w:rFonts w:ascii="Segoe UI" w:hAnsi="Segoe UI"/>
+          <w:b/>
+          <w:caps w:val="0"/>
+          <w:color w:val="1F4E5F"/>
+          <w:sz w:val="23"/>
+        </w:rPr>
+        <w:t>Extra  ·  docencia, investigación y cargos</w:t>
+      </w:r>
+    </w:p>
+    <w:p>
+      <w:pPr>
+        <w:spacing w:before="0" w:after="120"/>
+      </w:pPr>
+      <w:r>
+        <w:rPr>
+          <w:rFonts w:ascii="Segoe UI" w:hAnsi="Segoe UI"/>
+          <w:b w:val="0"/>
+          <w:caps w:val="0"/>
+          <w:color w:val="5A5A5A"/>
+          <w:sz w:val="20"/>
+        </w:rPr>
+        <w:t>Fuera de las fases. No depende del sitio, pero el sitio y el CV lo sostienen.</w:t>
+      </w:r>
+    </w:p>
+    <w:p>
+      <w:pPr>
+        <w:spacing w:before="160" w:after="40"/>
+        <w:ind w:left="539" w:hanging="539"/>
+      </w:pPr>
+      <w:r>
+        <w:rPr>
+          <w:rFonts w:ascii="Segoe UI" w:hAnsi="Segoe UI"/>
+          <w:b/>
+          <w:color w:val="1F4E5F"/>
+          <w:sz w:val="22"/>
+        </w:rPr>
+        <w:t xml:space="preserve">★  </w:t>
+      </w:r>
+      <w:r>
+        <w:rPr>
+          <w:rFonts w:ascii="Segoe UI" w:hAnsi="Segoe UI"/>
+          <w:b/>
+          <w:color w:val="111111"/>
+          <w:sz w:val="22"/>
+        </w:rPr>
+        <w:t>Octubre 2026  ·  postular a por lo menos tres universidades</w:t>
+      </w:r>
+    </w:p>
+    <w:p>
+      <w:pPr>
+        <w:spacing w:after="120"/>
+        <w:ind w:left="539"/>
+      </w:pPr>
+      <w:r>
+        <w:rPr>
+          <w:rFonts w:ascii="Segoe UI" w:hAnsi="Segoe UI"/>
+          <w:color w:val="111111"/>
+          <w:sz w:val="20"/>
+        </w:rPr>
+        <w:t>Un curso de innovación o maker para el primer semestre de 2027. La única convocatoria abierta que calza es la de la UDP, Laboratorio de Metodologías Creativas, que cierra el 6 de octubre. Las otras dos, espontáneas: UTEM y Duoc son las mejores candidatas.</w:t>
+      </w:r>
+    </w:p>
+    <w:p>
+      <w:pPr>
+        <w:spacing w:before="160" w:after="40"/>
+        <w:ind w:left="539" w:hanging="539"/>
+      </w:pPr>
+      <w:r>
+        <w:rPr>
+          <w:rFonts w:ascii="Segoe UI" w:hAnsi="Segoe UI"/>
+          <w:b/>
+          <w:color w:val="1F4E5F"/>
+          <w:sz w:val="22"/>
+        </w:rPr>
+        <w:t xml:space="preserve">+  </w:t>
+      </w:r>
+      <w:r>
+        <w:rPr>
+          <w:rFonts w:ascii="Segoe UI" w:hAnsi="Segoe UI"/>
+          <w:b/>
+          <w:color w:val="111111"/>
+          <w:sz w:val="22"/>
+        </w:rPr>
+        <w:t>La búsqueda</w:t>
+      </w:r>
+    </w:p>
+    <w:p>
+      <w:pPr>
+        <w:spacing w:after="120"/>
+        <w:ind w:left="539"/>
+      </w:pPr>
+      <w:r>
+        <w:rPr>
+          <w:rFonts w:ascii="Segoe UI" w:hAnsi="Segoe UI"/>
+          <w:color w:val="111111"/>
+          <w:sz w:val="20"/>
+        </w:rPr>
+        <w:t>Asignaturas que calzan con el perfil, investigación, y cargos públicos y privados. Revisada el 24 de septiembre, con enlaces y fechas, en oportunidades-2026.md.</w:t>
       </w:r>
     </w:p>
     <w:tbl>
@@ -6824,7 +7101,7 @@
           <w:color w:val="5A5A5A"/>
           <w:sz w:val="20"/>
         </w:rPr>
-        <w:t>Espacio para anotar qué cambió desde el 21 de septiembre de 2026.</w:t>
+        <w:t>Espacio para anotar qué cambió desde el 24 de septiembre de 2026.</w:t>
       </w:r>
     </w:p>
     <w:tbl>
@@ -7243,7 +7520,7 @@
           <w:color w:val="5A5A5A"/>
           <w:sz w:val="16"/>
         </w:rPr>
-        <w:t>Documento generado el 21 de septiembre de 2026  ·  Versión técnica en documentacion/PROYECTO.md  ·  Medición completa en documentacion/linea-base-2026-09-20.md  ·  Pendientes vivos en FALTANTES.md</w:t>
+        <w:t>Documento generado el 24 de septiembre de 2026  ·  Versión técnica en documentacion/PROYECTO.md  ·  Medición completa en documentacion/linea-base-2026-09-20.md  ·  Pendientes vivos en FALTANTES.md</w:t>
       </w:r>
     </w:p>
     <w:sectPr>

</xml_diff>

<commit_message>
Plan: fase G, canal Proyecto Ja, con su documento y pendientes
Co-Authored-By: Claude Sonnet 5.5 <noreply@anthropic.com>
</commit_message>
<xml_diff>
--- a/documentacion/Proyecto-portafolio.docx
+++ b/documentacion/Proyecto-portafolio.docx
@@ -60,7 +60,7 @@
           <w:color w:val="1F4E5F"/>
           <w:sz w:val="20"/>
         </w:rPr>
-        <w:t>Actualizado al 24 de septiembre de 2026</w:t>
+        <w:t>Actualizado al 1 de octubre de 2026</w:t>
       </w:r>
     </w:p>
     <w:tbl>
@@ -737,6 +737,70 @@
                 <w:sz w:val="18"/>
               </w:rPr>
               <w:t>documentacion/oportunidades-2026.md</w:t>
+            </w:r>
+          </w:p>
+        </w:tc>
+      </w:tr>
+      <w:tr>
+        <w:tc>
+          <w:tcPr>
+            <w:tcW w:type="dxa" w:w="2608"/>
+            <w:tcMar>
+              <w:top w:w="70" w:type="dxa"/>
+              <w:bottom w:w="70" w:type="dxa"/>
+              <w:left w:w="120" w:type="dxa"/>
+              <w:right w:w="120" w:type="dxa"/>
+            </w:tcMar>
+            <w:tcBorders>
+              <w:top w:val="single" w:sz="4" w:color="D8D6D2"/>
+              <w:bottom w:val="single" w:sz="4" w:color="D8D6D2"/>
+              <w:left w:val="nil"/>
+              <w:right w:val="nil"/>
+            </w:tcBorders>
+          </w:tcPr>
+          <w:p>
+            <w:pPr>
+              <w:spacing w:after="0" w:before="0" w:line="269" w:lineRule="auto"/>
+            </w:pPr>
+            <w:r>
+              <w:rPr>
+                <w:rFonts w:ascii="Segoe UI" w:hAnsi="Segoe UI"/>
+                <w:b w:val="0"/>
+                <w:color w:val="111111"/>
+                <w:sz w:val="18"/>
+              </w:rPr>
+              <w:t>Canal de YouTube</w:t>
+            </w:r>
+          </w:p>
+        </w:tc>
+        <w:tc>
+          <w:tcPr>
+            <w:tcW w:type="dxa" w:w="7143"/>
+            <w:tcMar>
+              <w:top w:w="70" w:type="dxa"/>
+              <w:bottom w:w="70" w:type="dxa"/>
+              <w:left w:w="120" w:type="dxa"/>
+              <w:right w:w="120" w:type="dxa"/>
+            </w:tcMar>
+            <w:tcBorders>
+              <w:top w:val="single" w:sz="4" w:color="D8D6D2"/>
+              <w:bottom w:val="single" w:sz="4" w:color="D8D6D2"/>
+              <w:left w:val="nil"/>
+              <w:right w:val="nil"/>
+            </w:tcBorders>
+          </w:tcPr>
+          <w:p>
+            <w:pPr>
+              <w:spacing w:after="0" w:before="0" w:line="269" w:lineRule="auto"/>
+            </w:pPr>
+            <w:r>
+              <w:rPr>
+                <w:rFonts w:ascii="Segoe UI" w:hAnsi="Segoe UI"/>
+                <w:b w:val="0"/>
+                <w:color w:val="5A5A5A"/>
+                <w:sz w:val="18"/>
+              </w:rPr>
+              <w:t>documentacion/canal-youtube.md</w:t>
             </w:r>
           </w:p>
         </w:tc>
@@ -5675,6 +5739,44 @@
           <w:color w:val="1F4E5F"/>
           <w:sz w:val="22"/>
         </w:rPr>
+        <w:t xml:space="preserve">G.  </w:t>
+      </w:r>
+      <w:r>
+        <w:rPr>
+          <w:rFonts w:ascii="Segoe UI" w:hAnsi="Segoe UI"/>
+          <w:b/>
+          <w:color w:val="111111"/>
+          <w:sz w:val="22"/>
+        </w:rPr>
+        <w:t>Canal Proyecto Ja  ·  NUEVA</w:t>
+      </w:r>
+    </w:p>
+    <w:p>
+      <w:pPr>
+        <w:spacing w:after="120"/>
+        <w:ind w:left="539"/>
+      </w:pPr>
+      <w:r>
+        <w:rPr>
+          <w:rFonts w:ascii="Segoe UI" w:hAnsi="Segoe UI"/>
+          <w:color w:val="111111"/>
+          <w:sz w:val="20"/>
+        </w:rPr>
+        <w:t>Canal de YouTube para documentar el Magíster en Ciencias del Diseño (UAI) y las innovaciones e integraciones de IA, hablando a cámara con fondo maker. Cada video tiene su entrada en el blog del sitio, así que primero hay que construir el blog. Es la aplicación directa de la fase E y de la posición «el practicante que documenta». Nombre, primeros diez videos, equipo y rutina en canal-youtube.md.</w:t>
+      </w:r>
+    </w:p>
+    <w:p>
+      <w:pPr>
+        <w:spacing w:before="160" w:after="40"/>
+        <w:ind w:left="539" w:hanging="539"/>
+      </w:pPr>
+      <w:r>
+        <w:rPr>
+          <w:rFonts w:ascii="Segoe UI" w:hAnsi="Segoe UI"/>
+          <w:b/>
+          <w:color w:val="1F4E5F"/>
+          <w:sz w:val="22"/>
+        </w:rPr>
         <w:t xml:space="preserve">→  </w:t>
       </w:r>
       <w:r>
@@ -6125,7 +6227,38 @@
           <w:color w:val="111111"/>
           <w:sz w:val="20"/>
         </w:rPr>
-        <w:t>cerrar las dos decisiones pendientes: las fotos con menores, y si el blog vive dentro o fuera.</w:t>
+        <w:t>cerrar la decisión pendiente de las fotos con menores. El blog vive dentro del sitio (decidido el 1 de octubre).</w:t>
+      </w:r>
+    </w:p>
+    <w:p>
+      <w:pPr>
+        <w:spacing w:after="70"/>
+        <w:ind w:left="351" w:hanging="215"/>
+      </w:pPr>
+      <w:r>
+        <w:rPr>
+          <w:rFonts w:ascii="Segoe UI" w:hAnsi="Segoe UI"/>
+          <w:color w:val="1F4E5F"/>
+          <w:sz w:val="20"/>
+        </w:rPr>
+        <w:t xml:space="preserve">—  </w:t>
+      </w:r>
+      <w:r>
+        <w:rPr>
+          <w:rFonts w:ascii="Segoe UI" w:hAnsi="Segoe UI"/>
+          <w:b/>
+          <w:color w:val="111111"/>
+          <w:sz w:val="20"/>
+        </w:rPr>
+        <w:t xml:space="preserve">Canal: </w:t>
+      </w:r>
+      <w:r>
+        <w:rPr>
+          <w:rFonts w:ascii="Segoe UI" w:hAnsi="Segoe UI"/>
+          <w:color w:val="111111"/>
+          <w:sz w:val="20"/>
+        </w:rPr>
+        <w:t>crear el canal Proyecto Ja, construir la sección de blog y publicar el primer video con su página.</w:t>
       </w:r>
     </w:p>
     <w:p>
@@ -7020,6 +7153,134 @@
                 <w:color w:val="111111"/>
                 <w:sz w:val="18"/>
               </w:rPr>
+              <w:t>El blog vive dentro del sitio</w:t>
+            </w:r>
+          </w:p>
+        </w:tc>
+        <w:tc>
+          <w:tcPr>
+            <w:tcW w:type="dxa" w:w="6350"/>
+            <w:tcMar>
+              <w:top w:w="70" w:type="dxa"/>
+              <w:bottom w:w="70" w:type="dxa"/>
+              <w:left w:w="120" w:type="dxa"/>
+              <w:right w:w="120" w:type="dxa"/>
+            </w:tcMar>
+            <w:tcBorders>
+              <w:top w:val="single" w:sz="4" w:color="D8D6D2"/>
+              <w:bottom w:val="single" w:sz="4" w:color="D8D6D2"/>
+              <w:left w:val="nil"/>
+              <w:right w:val="nil"/>
+            </w:tcBorders>
+          </w:tcPr>
+          <w:p>
+            <w:pPr>
+              <w:spacing w:after="0" w:before="0" w:line="269" w:lineRule="auto"/>
+            </w:pPr>
+            <w:r>
+              <w:rPr>
+                <w:rFonts w:ascii="Segoe UI" w:hAnsi="Segoe UI"/>
+                <w:b w:val="0"/>
+                <w:color w:val="5A5A5A"/>
+                <w:sz w:val="18"/>
+              </w:rPr>
+              <w:t>Cada video del canal tiene su página; la página queda y es lo que se cita</w:t>
+            </w:r>
+          </w:p>
+        </w:tc>
+      </w:tr>
+      <w:tr>
+        <w:tc>
+          <w:tcPr>
+            <w:tcW w:type="dxa" w:w="3402"/>
+            <w:tcMar>
+              <w:top w:w="70" w:type="dxa"/>
+              <w:bottom w:w="70" w:type="dxa"/>
+              <w:left w:w="120" w:type="dxa"/>
+              <w:right w:w="120" w:type="dxa"/>
+            </w:tcMar>
+            <w:tcBorders>
+              <w:top w:val="single" w:sz="4" w:color="D8D6D2"/>
+              <w:bottom w:val="single" w:sz="4" w:color="D8D6D2"/>
+              <w:left w:val="nil"/>
+              <w:right w:val="nil"/>
+            </w:tcBorders>
+          </w:tcPr>
+          <w:p>
+            <w:pPr>
+              <w:spacing w:after="0" w:before="0" w:line="269" w:lineRule="auto"/>
+            </w:pPr>
+            <w:r>
+              <w:rPr>
+                <w:rFonts w:ascii="Segoe UI" w:hAnsi="Segoe UI"/>
+                <w:b w:val="0"/>
+                <w:color w:val="111111"/>
+                <w:sz w:val="18"/>
+              </w:rPr>
+              <w:t>El canal se llama Proyecto Ja</w:t>
+            </w:r>
+          </w:p>
+        </w:tc>
+        <w:tc>
+          <w:tcPr>
+            <w:tcW w:type="dxa" w:w="6350"/>
+            <w:tcMar>
+              <w:top w:w="70" w:type="dxa"/>
+              <w:bottom w:w="70" w:type="dxa"/>
+              <w:left w:w="120" w:type="dxa"/>
+              <w:right w:w="120" w:type="dxa"/>
+            </w:tcMar>
+            <w:tcBorders>
+              <w:top w:val="single" w:sz="4" w:color="D8D6D2"/>
+              <w:bottom w:val="single" w:sz="4" w:color="D8D6D2"/>
+              <w:left w:val="nil"/>
+              <w:right w:val="nil"/>
+            </w:tcBorders>
+          </w:tcPr>
+          <w:p>
+            <w:pPr>
+              <w:spacing w:after="0" w:before="0" w:line="269" w:lineRule="auto"/>
+            </w:pPr>
+            <w:r>
+              <w:rPr>
+                <w:rFonts w:ascii="Segoe UI" w:hAnsi="Segoe UI"/>
+                <w:b w:val="0"/>
+                <w:color w:val="5A5A5A"/>
+                <w:sz w:val="18"/>
+              </w:rPr>
+              <w:t>Ja es la marca del sitio; el nombre propio choca con un futbolista y un luchador</w:t>
+            </w:r>
+          </w:p>
+        </w:tc>
+      </w:tr>
+      <w:tr>
+        <w:tc>
+          <w:tcPr>
+            <w:tcW w:type="dxa" w:w="3402"/>
+            <w:tcMar>
+              <w:top w:w="70" w:type="dxa"/>
+              <w:bottom w:w="70" w:type="dxa"/>
+              <w:left w:w="120" w:type="dxa"/>
+              <w:right w:w="120" w:type="dxa"/>
+            </w:tcMar>
+            <w:tcBorders>
+              <w:top w:val="single" w:sz="4" w:color="D8D6D2"/>
+              <w:bottom w:val="single" w:sz="4" w:color="D8D6D2"/>
+              <w:left w:val="nil"/>
+              <w:right w:val="nil"/>
+            </w:tcBorders>
+          </w:tcPr>
+          <w:p>
+            <w:pPr>
+              <w:spacing w:after="0" w:before="0" w:line="269" w:lineRule="auto"/>
+            </w:pPr>
+            <w:r>
+              <w:rPr>
+                <w:rFonts w:ascii="Segoe UI" w:hAnsi="Segoe UI"/>
+                <w:b w:val="0"/>
+                <w:color w:val="111111"/>
+                <w:sz w:val="18"/>
+              </w:rPr>
               <w:t>No ponerse en el mapa del ecosistema</w:t>
             </w:r>
           </w:p>
@@ -7101,7 +7362,7 @@
           <w:color w:val="5A5A5A"/>
           <w:sz w:val="20"/>
         </w:rPr>
-        <w:t>Espacio para anotar qué cambió desde el 24 de septiembre de 2026.</w:t>
+        <w:t>Espacio para anotar qué cambió desde el 1 de octubre de 2026.</w:t>
       </w:r>
     </w:p>
     <w:tbl>
@@ -7520,7 +7781,7 @@
           <w:color w:val="5A5A5A"/>
           <w:sz w:val="16"/>
         </w:rPr>
-        <w:t>Documento generado el 24 de septiembre de 2026  ·  Versión técnica en documentacion/PROYECTO.md  ·  Medición completa en documentacion/linea-base-2026-09-20.md  ·  Pendientes vivos en FALTANTES.md</w:t>
+        <w:t>Documento generado el 1 de octubre de 2026  ·  Versión técnica en documentacion/PROYECTO.md  ·  Medición completa en documentacion/linea-base-2026-09-20.md  ·  Canal en documentacion/canal-youtube.md  ·  Pendientes vivos en FALTANTES.md</w:t>
       </w:r>
     </w:p>
     <w:sectPr>

</xml_diff>